<commit_message>
[Spec Kit] Implement address postal UI progress
</commit_message>
<xml_diff>
--- a/docs/test-files/by-language/en/en_office.docx
+++ b/docs/test-files/by-language/en/en_office.docx
@@ -48,6 +48,26 @@
     <w:p>
       <w:r>
         <w:t>Postal code: 10001</w:t>
+      </w:r>
+    </w:p>
+    <w:p>
+      <w:r>
+        <w:t>Address: 123 Market Street, New York, NY</w:t>
+      </w:r>
+    </w:p>
+    <w:p>
+      <w:r>
+        <w:t>Combined: Alice Smith phone 202-555-0143 ZIP 10001 Address: 123 Market Street, New York, NY</w:t>
+      </w:r>
+    </w:p>
+    <w:p>
+      <w:r>
+        <w:t>Japan postal out of scope for English: 100-0001</w:t>
+      </w:r>
+    </w:p>
+    <w:p>
+      <w:r>
+        <w:t>Ambiguous location note: New York office</w:t>
       </w:r>
     </w:p>
     <w:p>

</xml_diff>